<commit_message>
build: generate Word versions of SRS, SAD and Test Plan
</commit_message>
<xml_diff>
--- a/submission/SRS-Blood-Bank-Management-System.docx
+++ b/submission/SRS-Blood-Bank-Management-System.docx
@@ -1078,7 +1078,7 @@
               <w:rPr>
                 <w:sz w:val="18"/>
               </w:rPr>
-              <w:t>08 Sep 2026</w:t>
+              <w:t>09 Sep 2026</w:t>
             </w:r>
           </w:p>
         </w:tc>
@@ -1131,7 +1131,7 @@
               <w:rPr>
                 <w:sz w:val="18"/>
               </w:rPr>
-              <w:t>Niveditha</w:t>
+              <w:t>G A Aadish</w:t>
             </w:r>
           </w:p>
         </w:tc>
@@ -1148,7 +1148,7 @@
               <w:rPr>
                 <w:sz w:val="18"/>
               </w:rPr>
-              <w:t>08 Sep 2026</w:t>
+              <w:t>09 Sep 2026</w:t>
             </w:r>
           </w:p>
         </w:tc>
@@ -1165,7 +1165,7 @@
               <w:rPr>
                 <w:sz w:val="18"/>
               </w:rPr>
-              <w:t>Section 3 External Interface Requirements added; screen inventory, error message and confirmation standards defined.</w:t>
+              <w:t>Section 5 System Features SF-4 to SF-6 with functional requirements REQ-24 to REQ-46.</w:t>
             </w:r>
           </w:p>
         </w:tc>
@@ -1201,7 +1201,7 @@
               <w:rPr>
                 <w:sz w:val="18"/>
               </w:rPr>
-              <w:t>Dhanya K M</w:t>
+              <w:t>Niveditha</w:t>
             </w:r>
           </w:p>
         </w:tc>
@@ -1218,7 +1218,7 @@
               <w:rPr>
                 <w:sz w:val="18"/>
               </w:rPr>
-              <w:t>08 Sep 2026</w:t>
+              <w:t>11 Sep 2026</w:t>
             </w:r>
           </w:p>
         </w:tc>
@@ -1235,7 +1235,7 @@
               <w:rPr>
                 <w:sz w:val="18"/>
               </w:rPr>
-              <w:t>Section 4 Analysis Models added: use case, ER, DFD Level 0 and DFD Level 1 Sheets A and B.</w:t>
+              <w:t>Section 6 Nonfunctional Requirements and Section 7 Other Requirements.</w:t>
             </w:r>
           </w:p>
         </w:tc>
@@ -1271,7 +1271,7 @@
               <w:rPr>
                 <w:sz w:val="18"/>
               </w:rPr>
-              <w:t>Balaraj R</w:t>
+              <w:t>Dhanya K M</w:t>
             </w:r>
           </w:p>
         </w:tc>
@@ -1288,7 +1288,7 @@
               <w:rPr>
                 <w:sz w:val="18"/>
               </w:rPr>
-              <w:t>08 Sep 2026</w:t>
+              <w:t>11 Sep 2026</w:t>
             </w:r>
           </w:p>
         </w:tc>
@@ -1305,7 +1305,7 @@
               <w:rPr>
                 <w:sz w:val="18"/>
               </w:rPr>
-              <w:t>Section 5 System Features SF-1 to SF-3 with functional requirements REQ-1 to REQ-23.</w:t>
+              <w:t>Section 4 Analysis Models added: use case, ER, DFD Level 0 and DFD Level 1 Sheets A and B.</w:t>
             </w:r>
           </w:p>
         </w:tc>
@@ -1341,7 +1341,7 @@
               <w:rPr>
                 <w:sz w:val="18"/>
               </w:rPr>
-              <w:t>G A Aadish</w:t>
+              <w:t>Dhanya K M</w:t>
             </w:r>
           </w:p>
         </w:tc>
@@ -1358,7 +1358,7 @@
               <w:rPr>
                 <w:sz w:val="18"/>
               </w:rPr>
-              <w:t>09 Sep 2026</w:t>
+              <w:t>11 Sep 2026</w:t>
             </w:r>
           </w:p>
         </w:tc>
@@ -1375,7 +1375,7 @@
               <w:rPr>
                 <w:sz w:val="18"/>
               </w:rPr>
-              <w:t>Section 5 System Features SF-4 to SF-6 with functional requirements REQ-24 to REQ-46.</w:t>
+              <w:t>Appendix A Glossary and Appendix B Field Layouts.</w:t>
             </w:r>
           </w:p>
         </w:tc>
@@ -1428,7 +1428,7 @@
               <w:rPr>
                 <w:sz w:val="18"/>
               </w:rPr>
-              <w:t>09 Sep 2026</w:t>
+              <w:t>29 Sep 2026</w:t>
             </w:r>
           </w:p>
         </w:tc>
@@ -1445,7 +1445,7 @@
               <w:rPr>
                 <w:sz w:val="18"/>
               </w:rPr>
-              <w:t>Section 6 Nonfunctional Requirements and Section 7 Other Requirements.</w:t>
+              <w:t>Section 3 External Interface Requirements added; screen inventory, error message and confirmation standards defined.</w:t>
             </w:r>
           </w:p>
         </w:tc>
@@ -1481,7 +1481,7 @@
               <w:rPr>
                 <w:sz w:val="18"/>
               </w:rPr>
-              <w:t>Dhanya K M</w:t>
+              <w:t>Balaraj R</w:t>
             </w:r>
           </w:p>
         </w:tc>
@@ -1498,7 +1498,7 @@
               <w:rPr>
                 <w:sz w:val="18"/>
               </w:rPr>
-              <w:t>09 Sep 2026</w:t>
+              <w:t>02 Oct 2026</w:t>
             </w:r>
           </w:p>
         </w:tc>
@@ -1515,7 +1515,7 @@
               <w:rPr>
                 <w:sz w:val="18"/>
               </w:rPr>
-              <w:t>Appendix A Glossary and Appendix B Field Layouts.</w:t>
+              <w:t>Section 5 System Features SF-1 to SF-3 with functional requirements REQ-1 to REQ-23.</w:t>
             </w:r>
           </w:p>
         </w:tc>
@@ -1568,7 +1568,7 @@
               <w:rPr>
                 <w:sz w:val="18"/>
               </w:rPr>
-              <w:t>09 Sep 2026</w:t>
+              <w:t>02 Oct 2026</w:t>
             </w:r>
           </w:p>
         </w:tc>
@@ -1638,7 +1638,7 @@
               <w:rPr>
                 <w:sz w:val="18"/>
               </w:rPr>
-              <w:t>10 Sep 2026</w:t>
+              <w:t>02 Oct 2026</w:t>
             </w:r>
           </w:p>
         </w:tc>
@@ -1708,7 +1708,7 @@
               <w:rPr>
                 <w:sz w:val="18"/>
               </w:rPr>
-              <w:t>10 Sep 2026</w:t>
+              <w:t>02 Oct 2026</w:t>
             </w:r>
           </w:p>
         </w:tc>
@@ -4403,475 +4403,7 @@
         <w:t>diagrams/</w:t>
       </w:r>
       <w:r>
-        <w:t xml:space="preserve"> directory of the project repository and are reproduced here by reference.</w:t>
-      </w:r>
-    </w:p>
-    <w:tbl>
-      <w:tblPr>
-        <w:tblStyle w:val="TableGrid"/>
-        <w:tblW w:type="auto" w:w="0"/>
-        <w:tblLayout w:type="autofit"/>
-        <w:tblLook w:firstColumn="1" w:firstRow="1" w:lastColumn="0" w:lastRow="0" w:noHBand="0" w:noVBand="1" w:val="04A0"/>
-      </w:tblPr>
-      <w:tblGrid>
-        <w:gridCol w:w="3408"/>
-        <w:gridCol w:w="3408"/>
-        <w:gridCol w:w="3408"/>
-      </w:tblGrid>
-      <w:tr>
-        <w:trPr>
-          <w:tblHeader w:val="true"/>
-        </w:trPr>
-        <w:tc>
-          <w:tcPr>
-            <w:tcW w:type="dxa" w:w="3408"/>
-            <w:shd w:val="clear" w:fill="DCE6F1"/>
-          </w:tcPr>
-          <w:p>
-            <w:pPr>
-              <w:spacing w:after="40"/>
-            </w:pPr>
-            <w:r>
-              <w:rPr>
-                <w:b/>
-              </w:rPr>
-            </w:r>
-            <w:r>
-              <w:rPr>
-                <w:b/>
-                <w:sz w:val="18"/>
-              </w:rPr>
-              <w:t>Model</w:t>
-            </w:r>
-          </w:p>
-        </w:tc>
-        <w:tc>
-          <w:tcPr>
-            <w:tcW w:type="dxa" w:w="3408"/>
-            <w:shd w:val="clear" w:fill="DCE6F1"/>
-          </w:tcPr>
-          <w:p>
-            <w:pPr>
-              <w:spacing w:after="40"/>
-            </w:pPr>
-            <w:r>
-              <w:rPr>
-                <w:b/>
-              </w:rPr>
-            </w:r>
-            <w:r>
-              <w:rPr>
-                <w:b/>
-                <w:sz w:val="18"/>
-              </w:rPr>
-              <w:t>Source File</w:t>
-            </w:r>
-          </w:p>
-        </w:tc>
-        <w:tc>
-          <w:tcPr>
-            <w:tcW w:type="dxa" w:w="3408"/>
-            <w:shd w:val="clear" w:fill="DCE6F1"/>
-          </w:tcPr>
-          <w:p>
-            <w:pPr>
-              <w:spacing w:after="40"/>
-            </w:pPr>
-            <w:r>
-              <w:rPr>
-                <w:b/>
-              </w:rPr>
-            </w:r>
-            <w:r>
-              <w:rPr>
-                <w:b/>
-                <w:sz w:val="18"/>
-              </w:rPr>
-              <w:t>Purpose</w:t>
-            </w:r>
-          </w:p>
-        </w:tc>
-      </w:tr>
-      <w:tr>
-        <w:tc>
-          <w:tcPr>
-            <w:tcW w:type="dxa" w:w="3408"/>
-          </w:tcPr>
-          <w:p>
-            <w:pPr>
-              <w:spacing w:after="40"/>
-            </w:pPr>
-            <w:r/>
-            <w:r>
-              <w:rPr>
-                <w:sz w:val="18"/>
-              </w:rPr>
-              <w:t>Use Case Diagram</w:t>
-            </w:r>
-          </w:p>
-        </w:tc>
-        <w:tc>
-          <w:tcPr>
-            <w:tcW w:type="dxa" w:w="3408"/>
-          </w:tcPr>
-          <w:p>
-            <w:pPr>
-              <w:spacing w:after="40"/>
-            </w:pPr>
-            <w:r/>
-            <w:r>
-              <w:rPr>
-                <w:rFonts w:ascii="Consolas" w:hAnsi="Consolas"/>
-                <w:color w:val="B03060"/>
-                <w:sz w:val="18"/>
-              </w:rPr>
-              <w:t>diagrams/use-case.mmd</w:t>
-            </w:r>
-          </w:p>
-        </w:tc>
-        <w:tc>
-          <w:tcPr>
-            <w:tcW w:type="dxa" w:w="3408"/>
-          </w:tcPr>
-          <w:p>
-            <w:pPr>
-              <w:spacing w:after="40"/>
-            </w:pPr>
-            <w:r/>
-            <w:r>
-              <w:rPr>
-                <w:sz w:val="18"/>
-              </w:rPr>
-              <w:t>Actors and the use cases each may perform</w:t>
-            </w:r>
-          </w:p>
-        </w:tc>
-      </w:tr>
-      <w:tr>
-        <w:tc>
-          <w:tcPr>
-            <w:tcW w:type="dxa" w:w="3408"/>
-          </w:tcPr>
-          <w:p>
-            <w:pPr>
-              <w:spacing w:after="40"/>
-            </w:pPr>
-            <w:r/>
-            <w:r>
-              <w:rPr>
-                <w:sz w:val="18"/>
-              </w:rPr>
-              <w:t>Entity Relationship Diagram</w:t>
-            </w:r>
-          </w:p>
-        </w:tc>
-        <w:tc>
-          <w:tcPr>
-            <w:tcW w:type="dxa" w:w="3408"/>
-          </w:tcPr>
-          <w:p>
-            <w:pPr>
-              <w:spacing w:after="40"/>
-            </w:pPr>
-            <w:r/>
-            <w:r>
-              <w:rPr>
-                <w:rFonts w:ascii="Consolas" w:hAnsi="Consolas"/>
-                <w:color w:val="B03060"/>
-                <w:sz w:val="18"/>
-              </w:rPr>
-              <w:t>diagrams/er-diagram.mmd</w:t>
-            </w:r>
-          </w:p>
-        </w:tc>
-        <w:tc>
-          <w:tcPr>
-            <w:tcW w:type="dxa" w:w="3408"/>
-          </w:tcPr>
-          <w:p>
-            <w:pPr>
-              <w:spacing w:after="40"/>
-            </w:pPr>
-            <w:r/>
-            <w:r>
-              <w:rPr>
-                <w:sz w:val="18"/>
-              </w:rPr>
-              <w:t>Persistent entities, attributes and cardinalities</w:t>
-            </w:r>
-          </w:p>
-        </w:tc>
-      </w:tr>
-      <w:tr>
-        <w:tc>
-          <w:tcPr>
-            <w:tcW w:type="dxa" w:w="3408"/>
-          </w:tcPr>
-          <w:p>
-            <w:pPr>
-              <w:spacing w:after="40"/>
-            </w:pPr>
-            <w:r/>
-            <w:r>
-              <w:rPr>
-                <w:sz w:val="18"/>
-              </w:rPr>
-              <w:t>Data Flow Diagram, Level 0</w:t>
-            </w:r>
-          </w:p>
-        </w:tc>
-        <w:tc>
-          <w:tcPr>
-            <w:tcW w:type="dxa" w:w="3408"/>
-          </w:tcPr>
-          <w:p>
-            <w:pPr>
-              <w:spacing w:after="40"/>
-            </w:pPr>
-            <w:r/>
-            <w:r>
-              <w:rPr>
-                <w:rFonts w:ascii="Consolas" w:hAnsi="Consolas"/>
-                <w:color w:val="B03060"/>
-                <w:sz w:val="18"/>
-              </w:rPr>
-              <w:t>diagrams/dfd-level0.mmd</w:t>
-            </w:r>
-          </w:p>
-        </w:tc>
-        <w:tc>
-          <w:tcPr>
-            <w:tcW w:type="dxa" w:w="3408"/>
-          </w:tcPr>
-          <w:p>
-            <w:pPr>
-              <w:spacing w:after="40"/>
-            </w:pPr>
-            <w:r/>
-            <w:r>
-              <w:rPr>
-                <w:sz w:val="18"/>
-              </w:rPr>
-              <w:t>System context and external entities</w:t>
-            </w:r>
-          </w:p>
-        </w:tc>
-      </w:tr>
-      <w:tr>
-        <w:tc>
-          <w:tcPr>
-            <w:tcW w:type="dxa" w:w="3408"/>
-          </w:tcPr>
-          <w:p>
-            <w:pPr>
-              <w:spacing w:after="40"/>
-            </w:pPr>
-            <w:r/>
-            <w:r>
-              <w:rPr>
-                <w:sz w:val="18"/>
-              </w:rPr>
-              <w:t>Data Flow Diagram, Level 1 Sheet A</w:t>
-            </w:r>
-          </w:p>
-        </w:tc>
-        <w:tc>
-          <w:tcPr>
-            <w:tcW w:type="dxa" w:w="3408"/>
-          </w:tcPr>
-          <w:p>
-            <w:pPr>
-              <w:spacing w:after="40"/>
-            </w:pPr>
-            <w:r/>
-            <w:r>
-              <w:rPr>
-                <w:rFonts w:ascii="Consolas" w:hAnsi="Consolas"/>
-                <w:color w:val="B03060"/>
-                <w:sz w:val="18"/>
-              </w:rPr>
-              <w:t>diagrams/dfd-level1a-supply.mmd</w:t>
-            </w:r>
-          </w:p>
-        </w:tc>
-        <w:tc>
-          <w:tcPr>
-            <w:tcW w:type="dxa" w:w="3408"/>
-          </w:tcPr>
-          <w:p>
-            <w:pPr>
-              <w:spacing w:after="40"/>
-            </w:pPr>
-            <w:r/>
-            <w:r>
-              <w:rPr>
-                <w:sz w:val="18"/>
-              </w:rPr>
-              <w:t>Processes 1.0 to 4.0, the supply side</w:t>
-            </w:r>
-          </w:p>
-        </w:tc>
-      </w:tr>
-      <w:tr>
-        <w:tc>
-          <w:tcPr>
-            <w:tcW w:type="dxa" w:w="3408"/>
-          </w:tcPr>
-          <w:p>
-            <w:pPr>
-              <w:spacing w:after="40"/>
-            </w:pPr>
-            <w:r/>
-            <w:r>
-              <w:rPr>
-                <w:sz w:val="18"/>
-              </w:rPr>
-              <w:t>Data Flow Diagram, Level 1 Sheet B</w:t>
-            </w:r>
-          </w:p>
-        </w:tc>
-        <w:tc>
-          <w:tcPr>
-            <w:tcW w:type="dxa" w:w="3408"/>
-          </w:tcPr>
-          <w:p>
-            <w:pPr>
-              <w:spacing w:after="40"/>
-            </w:pPr>
-            <w:r/>
-            <w:r>
-              <w:rPr>
-                <w:rFonts w:ascii="Consolas" w:hAnsi="Consolas"/>
-                <w:color w:val="B03060"/>
-                <w:sz w:val="18"/>
-              </w:rPr>
-              <w:t>diagrams/dfd-level1b-demand.mmd</w:t>
-            </w:r>
-          </w:p>
-        </w:tc>
-        <w:tc>
-          <w:tcPr>
-            <w:tcW w:type="dxa" w:w="3408"/>
-          </w:tcPr>
-          <w:p>
-            <w:pPr>
-              <w:spacing w:after="40"/>
-            </w:pPr>
-            <w:r/>
-            <w:r>
-              <w:rPr>
-                <w:sz w:val="18"/>
-              </w:rPr>
-              <w:t>Processes 5.0 to 9.0, demand, camps and reporting</w:t>
-            </w:r>
-          </w:p>
-        </w:tc>
-      </w:tr>
-      <w:tr>
-        <w:tc>
-          <w:tcPr>
-            <w:tcW w:type="dxa" w:w="3408"/>
-          </w:tcPr>
-          <w:p>
-            <w:pPr>
-              <w:spacing w:after="40"/>
-            </w:pPr>
-            <w:r/>
-            <w:r>
-              <w:rPr>
-                <w:sz w:val="18"/>
-              </w:rPr>
-              <w:t>Architecture Diagram</w:t>
-            </w:r>
-          </w:p>
-        </w:tc>
-        <w:tc>
-          <w:tcPr>
-            <w:tcW w:type="dxa" w:w="3408"/>
-          </w:tcPr>
-          <w:p>
-            <w:pPr>
-              <w:spacing w:after="40"/>
-            </w:pPr>
-            <w:r/>
-            <w:r>
-              <w:rPr>
-                <w:rFonts w:ascii="Consolas" w:hAnsi="Consolas"/>
-                <w:color w:val="B03060"/>
-                <w:sz w:val="18"/>
-              </w:rPr>
-              <w:t>diagrams/architecture.mmd</w:t>
-            </w:r>
-          </w:p>
-        </w:tc>
-        <w:tc>
-          <w:tcPr>
-            <w:tcW w:type="dxa" w:w="3408"/>
-          </w:tcPr>
-          <w:p>
-            <w:pPr>
-              <w:spacing w:after="40"/>
-            </w:pPr>
-            <w:r/>
-            <w:r>
-              <w:rPr>
-                <w:sz w:val="18"/>
-              </w:rPr>
-              <w:t>Tier decomposition and external gateways</w:t>
-            </w:r>
-          </w:p>
-        </w:tc>
-      </w:tr>
-    </w:tbl>
-    <w:p/>
-    <w:p>
-      <w:pPr>
-        <w:spacing w:after="120"/>
-      </w:pPr>
-      <w:r>
-        <w:rPr>
-          <w:b/>
-        </w:rPr>
-        <w:t>Actors.</w:t>
-      </w:r>
-      <w:r>
-        <w:t xml:space="preserve"> Donor, Blood Bank Staff, Hospital User, Administrator, and two external system actors, the SMS Gateway and the Email Gateway.</w:t>
-      </w:r>
-    </w:p>
-    <w:p>
-      <w:pPr>
-        <w:spacing w:after="120"/>
-      </w:pPr>
-      <w:r>
-        <w:rPr>
-          <w:b/>
-        </w:rPr>
-        <w:t>Principal entities.</w:t>
-      </w:r>
-      <w:r>
-        <w:t xml:space="preserve"> Donor, Donation, BloodUnit, ScreeningTest, Hospital, BloodRequest, RequestLineItem, Issue, Camp, CampEnrolment, User, Role, Notification and AuditLog. Attributes and cardinalities are given in the ER source and the field layouts in Appendix B.</w:t>
-      </w:r>
-    </w:p>
-    <w:p>
-      <w:pPr>
-        <w:spacing w:after="120"/>
-      </w:pPr>
-      <w:r>
-        <w:rPr>
-          <w:b/>
-        </w:rPr>
-        <w:t>Principal processes in the Level 1 data flow.</w:t>
-      </w:r>
-      <w:r>
-        <w:t xml:space="preserve"> Nine processes are identified: 1.0 register and screen donor, 2.0 record collection, 3.0 test and quarantine unit, 4.0 maintain inventory, 5.0 receive and approve request, 6.0 allocate and issue units, 7.0 manage camp, 8.0 generate report and 9.0 dispatch notification. The data stores are D1 Donor Store, D2 Unit Store, D3 Request Store, D4 Camp Store and D5 Audit Store.</w:t>
-      </w:r>
-    </w:p>
-    <w:p>
-      <w:pPr>
-        <w:spacing w:after="120"/>
-      </w:pPr>
-      <w:r>
-        <w:t>The Level 1 diagram is drawn on two sheets so that it remains legible. Sheet A carries processes 1.0 to 4.0, the path by which blood enters the system. Sheet B carries processes 5.0 to 9.0, the path by which blood leaves the system together with camp management, reporting and notification. Flows crossing between the sheets are marked with off-sheet connectors naming the process at the far end.</w:t>
+        <w:t xml:space="preserve"> directory of the project repository. The use case diagram is shown in full below because it is the primary analysis model; the remaining models are referenced by file.</w:t>
       </w:r>
     </w:p>
     <w:p>
@@ -5194,10 +4726,10 @@
     <w:p/>
     <w:p>
       <w:pPr>
-        <w:pStyle w:val="Heading1"/>
+        <w:pStyle w:val="Heading2"/>
       </w:pPr>
       <w:r>
-        <w:t>5. System Features</w:t>
+        <w:t>4.1 Use Case Diagram</w:t>
       </w:r>
     </w:p>
     <w:p>
@@ -5205,6 +4737,1853 @@
         <w:spacing w:after="120"/>
       </w:pPr>
       <w:r>
+        <w:t xml:space="preserve">*Figure: UML use case diagram. Actors are the Donor, Blood Bank Staff, Hospital User and Administrator, with the SMS and Email gateways as external system actors. Source: </w:t>
+      </w:r>
+      <w:r>
+        <w:rPr>
+          <w:rFonts w:ascii="Consolas" w:hAnsi="Consolas"/>
+          <w:color w:val="B03060"/>
+        </w:rPr>
+        <w:t>diagrams/use-case.mmd</w:t>
+      </w:r>
+      <w:r>
+        <w:t>.*</w:t>
+      </w:r>
+    </w:p>
+    <w:p>
+      <w:pPr>
+        <w:pStyle w:val="Heading2"/>
+      </w:pPr>
+      <w:r>
+        <w:t>4.2 Use Case Summary</w:t>
+      </w:r>
+    </w:p>
+    <w:tbl>
+      <w:tblPr>
+        <w:tblStyle w:val="TableGrid"/>
+        <w:tblW w:type="auto" w:w="0"/>
+        <w:tblLayout w:type="autofit"/>
+        <w:tblLook w:firstColumn="1" w:firstRow="1" w:lastColumn="0" w:lastRow="0" w:noHBand="0" w:noVBand="1" w:val="04A0"/>
+      </w:tblPr>
+      <w:tblGrid>
+        <w:gridCol w:w="2556"/>
+        <w:gridCol w:w="2556"/>
+        <w:gridCol w:w="2556"/>
+        <w:gridCol w:w="2556"/>
+      </w:tblGrid>
+      <w:tr>
+        <w:trPr>
+          <w:tblHeader w:val="true"/>
+        </w:trPr>
+        <w:tc>
+          <w:tcPr>
+            <w:tcW w:type="dxa" w:w="2556"/>
+            <w:shd w:val="clear" w:fill="DCE6F1"/>
+          </w:tcPr>
+          <w:p>
+            <w:pPr>
+              <w:spacing w:after="40"/>
+            </w:pPr>
+            <w:r>
+              <w:rPr>
+                <w:b/>
+              </w:rPr>
+            </w:r>
+            <w:r>
+              <w:rPr>
+                <w:b/>
+                <w:sz w:val="18"/>
+              </w:rPr>
+              <w:t>ID</w:t>
+            </w:r>
+          </w:p>
+        </w:tc>
+        <w:tc>
+          <w:tcPr>
+            <w:tcW w:type="dxa" w:w="2556"/>
+            <w:shd w:val="clear" w:fill="DCE6F1"/>
+          </w:tcPr>
+          <w:p>
+            <w:pPr>
+              <w:spacing w:after="40"/>
+            </w:pPr>
+            <w:r>
+              <w:rPr>
+                <w:b/>
+              </w:rPr>
+            </w:r>
+            <w:r>
+              <w:rPr>
+                <w:b/>
+                <w:sz w:val="18"/>
+              </w:rPr>
+              <w:t>Use Case</w:t>
+            </w:r>
+          </w:p>
+        </w:tc>
+        <w:tc>
+          <w:tcPr>
+            <w:tcW w:type="dxa" w:w="2556"/>
+            <w:shd w:val="clear" w:fill="DCE6F1"/>
+          </w:tcPr>
+          <w:p>
+            <w:pPr>
+              <w:spacing w:after="40"/>
+            </w:pPr>
+            <w:r>
+              <w:rPr>
+                <w:b/>
+              </w:rPr>
+            </w:r>
+            <w:r>
+              <w:rPr>
+                <w:b/>
+                <w:sz w:val="18"/>
+              </w:rPr>
+              <w:t>Primary Actor</w:t>
+            </w:r>
+          </w:p>
+        </w:tc>
+        <w:tc>
+          <w:tcPr>
+            <w:tcW w:type="dxa" w:w="2556"/>
+            <w:shd w:val="clear" w:fill="DCE6F1"/>
+          </w:tcPr>
+          <w:p>
+            <w:pPr>
+              <w:spacing w:after="40"/>
+            </w:pPr>
+            <w:r>
+              <w:rPr>
+                <w:b/>
+              </w:rPr>
+            </w:r>
+            <w:r>
+              <w:rPr>
+                <w:b/>
+                <w:sz w:val="18"/>
+              </w:rPr>
+              <w:t>Requirements</w:t>
+            </w:r>
+          </w:p>
+        </w:tc>
+      </w:tr>
+      <w:tr>
+        <w:tc>
+          <w:tcPr>
+            <w:tcW w:type="dxa" w:w="2556"/>
+          </w:tcPr>
+          <w:p>
+            <w:pPr>
+              <w:spacing w:after="40"/>
+            </w:pPr>
+            <w:r/>
+            <w:r>
+              <w:rPr>
+                <w:sz w:val="18"/>
+              </w:rPr>
+              <w:t>UC1</w:t>
+            </w:r>
+          </w:p>
+        </w:tc>
+        <w:tc>
+          <w:tcPr>
+            <w:tcW w:type="dxa" w:w="2556"/>
+          </w:tcPr>
+          <w:p>
+            <w:pPr>
+              <w:spacing w:after="40"/>
+            </w:pPr>
+            <w:r/>
+            <w:r>
+              <w:rPr>
+                <w:sz w:val="18"/>
+              </w:rPr>
+              <w:t>Register as Donor</w:t>
+            </w:r>
+          </w:p>
+        </w:tc>
+        <w:tc>
+          <w:tcPr>
+            <w:tcW w:type="dxa" w:w="2556"/>
+          </w:tcPr>
+          <w:p>
+            <w:pPr>
+              <w:spacing w:after="40"/>
+            </w:pPr>
+            <w:r/>
+            <w:r>
+              <w:rPr>
+                <w:sz w:val="18"/>
+              </w:rPr>
+              <w:t>Donor</w:t>
+            </w:r>
+          </w:p>
+        </w:tc>
+        <w:tc>
+          <w:tcPr>
+            <w:tcW w:type="dxa" w:w="2556"/>
+          </w:tcPr>
+          <w:p>
+            <w:pPr>
+              <w:spacing w:after="40"/>
+            </w:pPr>
+            <w:r/>
+            <w:r>
+              <w:rPr>
+                <w:sz w:val="18"/>
+              </w:rPr>
+              <w:t>REQ-1 to REQ-5</w:t>
+            </w:r>
+          </w:p>
+        </w:tc>
+      </w:tr>
+      <w:tr>
+        <w:tc>
+          <w:tcPr>
+            <w:tcW w:type="dxa" w:w="2556"/>
+          </w:tcPr>
+          <w:p>
+            <w:pPr>
+              <w:spacing w:after="40"/>
+            </w:pPr>
+            <w:r/>
+            <w:r>
+              <w:rPr>
+                <w:sz w:val="18"/>
+              </w:rPr>
+              <w:t>UC2</w:t>
+            </w:r>
+          </w:p>
+        </w:tc>
+        <w:tc>
+          <w:tcPr>
+            <w:tcW w:type="dxa" w:w="2556"/>
+          </w:tcPr>
+          <w:p>
+            <w:pPr>
+              <w:spacing w:after="40"/>
+            </w:pPr>
+            <w:r/>
+            <w:r>
+              <w:rPr>
+                <w:sz w:val="18"/>
+              </w:rPr>
+              <w:t>View Eligibility Status</w:t>
+            </w:r>
+          </w:p>
+        </w:tc>
+        <w:tc>
+          <w:tcPr>
+            <w:tcW w:type="dxa" w:w="2556"/>
+          </w:tcPr>
+          <w:p>
+            <w:pPr>
+              <w:spacing w:after="40"/>
+            </w:pPr>
+            <w:r/>
+            <w:r>
+              <w:rPr>
+                <w:sz w:val="18"/>
+              </w:rPr>
+              <w:t>Donor</w:t>
+            </w:r>
+          </w:p>
+        </w:tc>
+        <w:tc>
+          <w:tcPr>
+            <w:tcW w:type="dxa" w:w="2556"/>
+          </w:tcPr>
+          <w:p>
+            <w:pPr>
+              <w:spacing w:after="40"/>
+            </w:pPr>
+            <w:r/>
+            <w:r>
+              <w:rPr>
+                <w:sz w:val="18"/>
+              </w:rPr>
+              <w:t>REQ-6, REQ-8</w:t>
+            </w:r>
+          </w:p>
+        </w:tc>
+      </w:tr>
+      <w:tr>
+        <w:tc>
+          <w:tcPr>
+            <w:tcW w:type="dxa" w:w="2556"/>
+          </w:tcPr>
+          <w:p>
+            <w:pPr>
+              <w:spacing w:after="40"/>
+            </w:pPr>
+            <w:r/>
+            <w:r>
+              <w:rPr>
+                <w:sz w:val="18"/>
+              </w:rPr>
+              <w:t>UC3</w:t>
+            </w:r>
+          </w:p>
+        </w:tc>
+        <w:tc>
+          <w:tcPr>
+            <w:tcW w:type="dxa" w:w="2556"/>
+          </w:tcPr>
+          <w:p>
+            <w:pPr>
+              <w:spacing w:after="40"/>
+            </w:pPr>
+            <w:r/>
+            <w:r>
+              <w:rPr>
+                <w:sz w:val="18"/>
+              </w:rPr>
+              <w:t>Enrol in Camp</w:t>
+            </w:r>
+          </w:p>
+        </w:tc>
+        <w:tc>
+          <w:tcPr>
+            <w:tcW w:type="dxa" w:w="2556"/>
+          </w:tcPr>
+          <w:p>
+            <w:pPr>
+              <w:spacing w:after="40"/>
+            </w:pPr>
+            <w:r/>
+            <w:r>
+              <w:rPr>
+                <w:sz w:val="18"/>
+              </w:rPr>
+              <w:t>Donor</w:t>
+            </w:r>
+          </w:p>
+        </w:tc>
+        <w:tc>
+          <w:tcPr>
+            <w:tcW w:type="dxa" w:w="2556"/>
+          </w:tcPr>
+          <w:p>
+            <w:pPr>
+              <w:spacing w:after="40"/>
+            </w:pPr>
+            <w:r/>
+            <w:r>
+              <w:rPr>
+                <w:sz w:val="18"/>
+              </w:rPr>
+              <w:t>REQ-34, REQ-35</w:t>
+            </w:r>
+          </w:p>
+        </w:tc>
+      </w:tr>
+      <w:tr>
+        <w:tc>
+          <w:tcPr>
+            <w:tcW w:type="dxa" w:w="2556"/>
+          </w:tcPr>
+          <w:p>
+            <w:pPr>
+              <w:spacing w:after="40"/>
+            </w:pPr>
+            <w:r/>
+            <w:r>
+              <w:rPr>
+                <w:sz w:val="18"/>
+              </w:rPr>
+              <w:t>UC4</w:t>
+            </w:r>
+          </w:p>
+        </w:tc>
+        <w:tc>
+          <w:tcPr>
+            <w:tcW w:type="dxa" w:w="2556"/>
+          </w:tcPr>
+          <w:p>
+            <w:pPr>
+              <w:spacing w:after="40"/>
+            </w:pPr>
+            <w:r/>
+            <w:r>
+              <w:rPr>
+                <w:sz w:val="18"/>
+              </w:rPr>
+              <w:t>Screen Donor</w:t>
+            </w:r>
+          </w:p>
+        </w:tc>
+        <w:tc>
+          <w:tcPr>
+            <w:tcW w:type="dxa" w:w="2556"/>
+          </w:tcPr>
+          <w:p>
+            <w:pPr>
+              <w:spacing w:after="40"/>
+            </w:pPr>
+            <w:r/>
+            <w:r>
+              <w:rPr>
+                <w:sz w:val="18"/>
+              </w:rPr>
+              <w:t>Blood Bank Staff</w:t>
+            </w:r>
+          </w:p>
+        </w:tc>
+        <w:tc>
+          <w:tcPr>
+            <w:tcW w:type="dxa" w:w="2556"/>
+          </w:tcPr>
+          <w:p>
+            <w:pPr>
+              <w:spacing w:after="40"/>
+            </w:pPr>
+            <w:r/>
+            <w:r>
+              <w:rPr>
+                <w:sz w:val="18"/>
+              </w:rPr>
+              <w:t>REQ-6, REQ-7</w:t>
+            </w:r>
+          </w:p>
+        </w:tc>
+      </w:tr>
+      <w:tr>
+        <w:tc>
+          <w:tcPr>
+            <w:tcW w:type="dxa" w:w="2556"/>
+          </w:tcPr>
+          <w:p>
+            <w:pPr>
+              <w:spacing w:after="40"/>
+            </w:pPr>
+            <w:r/>
+            <w:r>
+              <w:rPr>
+                <w:sz w:val="18"/>
+              </w:rPr>
+              <w:t>UC5</w:t>
+            </w:r>
+          </w:p>
+        </w:tc>
+        <w:tc>
+          <w:tcPr>
+            <w:tcW w:type="dxa" w:w="2556"/>
+          </w:tcPr>
+          <w:p>
+            <w:pPr>
+              <w:spacing w:after="40"/>
+            </w:pPr>
+            <w:r/>
+            <w:r>
+              <w:rPr>
+                <w:sz w:val="18"/>
+              </w:rPr>
+              <w:t>Record Collection</w:t>
+            </w:r>
+          </w:p>
+        </w:tc>
+        <w:tc>
+          <w:tcPr>
+            <w:tcW w:type="dxa" w:w="2556"/>
+          </w:tcPr>
+          <w:p>
+            <w:pPr>
+              <w:spacing w:after="40"/>
+            </w:pPr>
+            <w:r/>
+            <w:r>
+              <w:rPr>
+                <w:sz w:val="18"/>
+              </w:rPr>
+              <w:t>Blood Bank Staff</w:t>
+            </w:r>
+          </w:p>
+        </w:tc>
+        <w:tc>
+          <w:tcPr>
+            <w:tcW w:type="dxa" w:w="2556"/>
+          </w:tcPr>
+          <w:p>
+            <w:pPr>
+              <w:spacing w:after="40"/>
+            </w:pPr>
+            <w:r/>
+            <w:r>
+              <w:rPr>
+                <w:sz w:val="18"/>
+              </w:rPr>
+              <w:t>REQ-9 to REQ-11</w:t>
+            </w:r>
+          </w:p>
+        </w:tc>
+      </w:tr>
+      <w:tr>
+        <w:tc>
+          <w:tcPr>
+            <w:tcW w:type="dxa" w:w="2556"/>
+          </w:tcPr>
+          <w:p>
+            <w:pPr>
+              <w:spacing w:after="40"/>
+            </w:pPr>
+            <w:r/>
+            <w:r>
+              <w:rPr>
+                <w:sz w:val="18"/>
+              </w:rPr>
+              <w:t>UC6</w:t>
+            </w:r>
+          </w:p>
+        </w:tc>
+        <w:tc>
+          <w:tcPr>
+            <w:tcW w:type="dxa" w:w="2556"/>
+          </w:tcPr>
+          <w:p>
+            <w:pPr>
+              <w:spacing w:after="40"/>
+            </w:pPr>
+            <w:r/>
+            <w:r>
+              <w:rPr>
+                <w:sz w:val="18"/>
+              </w:rPr>
+              <w:t>Enter Test Results</w:t>
+            </w:r>
+          </w:p>
+        </w:tc>
+        <w:tc>
+          <w:tcPr>
+            <w:tcW w:type="dxa" w:w="2556"/>
+          </w:tcPr>
+          <w:p>
+            <w:pPr>
+              <w:spacing w:after="40"/>
+            </w:pPr>
+            <w:r/>
+            <w:r>
+              <w:rPr>
+                <w:sz w:val="18"/>
+              </w:rPr>
+              <w:t>Blood Bank Staff</w:t>
+            </w:r>
+          </w:p>
+        </w:tc>
+        <w:tc>
+          <w:tcPr>
+            <w:tcW w:type="dxa" w:w="2556"/>
+          </w:tcPr>
+          <w:p>
+            <w:pPr>
+              <w:spacing w:after="40"/>
+            </w:pPr>
+            <w:r/>
+            <w:r>
+              <w:rPr>
+                <w:sz w:val="18"/>
+              </w:rPr>
+              <w:t>REQ-12 to REQ-14</w:t>
+            </w:r>
+          </w:p>
+        </w:tc>
+      </w:tr>
+      <w:tr>
+        <w:tc>
+          <w:tcPr>
+            <w:tcW w:type="dxa" w:w="2556"/>
+          </w:tcPr>
+          <w:p>
+            <w:pPr>
+              <w:spacing w:after="40"/>
+            </w:pPr>
+            <w:r/>
+            <w:r>
+              <w:rPr>
+                <w:sz w:val="18"/>
+              </w:rPr>
+              <w:t>UC7</w:t>
+            </w:r>
+          </w:p>
+        </w:tc>
+        <w:tc>
+          <w:tcPr>
+            <w:tcW w:type="dxa" w:w="2556"/>
+          </w:tcPr>
+          <w:p>
+            <w:pPr>
+              <w:spacing w:after="40"/>
+            </w:pPr>
+            <w:r/>
+            <w:r>
+              <w:rPr>
+                <w:sz w:val="18"/>
+              </w:rPr>
+              <w:t>Separate Components</w:t>
+            </w:r>
+          </w:p>
+        </w:tc>
+        <w:tc>
+          <w:tcPr>
+            <w:tcW w:type="dxa" w:w="2556"/>
+          </w:tcPr>
+          <w:p>
+            <w:pPr>
+              <w:spacing w:after="40"/>
+            </w:pPr>
+            <w:r/>
+            <w:r>
+              <w:rPr>
+                <w:sz w:val="18"/>
+              </w:rPr>
+              <w:t>Blood Bank Staff</w:t>
+            </w:r>
+          </w:p>
+        </w:tc>
+        <w:tc>
+          <w:tcPr>
+            <w:tcW w:type="dxa" w:w="2556"/>
+          </w:tcPr>
+          <w:p>
+            <w:pPr>
+              <w:spacing w:after="40"/>
+            </w:pPr>
+            <w:r/>
+            <w:r>
+              <w:rPr>
+                <w:sz w:val="18"/>
+              </w:rPr>
+              <w:t>REQ-15</w:t>
+            </w:r>
+          </w:p>
+        </w:tc>
+      </w:tr>
+      <w:tr>
+        <w:tc>
+          <w:tcPr>
+            <w:tcW w:type="dxa" w:w="2556"/>
+          </w:tcPr>
+          <w:p>
+            <w:pPr>
+              <w:spacing w:after="40"/>
+            </w:pPr>
+            <w:r/>
+            <w:r>
+              <w:rPr>
+                <w:sz w:val="18"/>
+              </w:rPr>
+              <w:t>UC8</w:t>
+            </w:r>
+          </w:p>
+        </w:tc>
+        <w:tc>
+          <w:tcPr>
+            <w:tcW w:type="dxa" w:w="2556"/>
+          </w:tcPr>
+          <w:p>
+            <w:pPr>
+              <w:spacing w:after="40"/>
+            </w:pPr>
+            <w:r/>
+            <w:r>
+              <w:rPr>
+                <w:sz w:val="18"/>
+              </w:rPr>
+              <w:t>Manage Inventory</w:t>
+            </w:r>
+          </w:p>
+        </w:tc>
+        <w:tc>
+          <w:tcPr>
+            <w:tcW w:type="dxa" w:w="2556"/>
+          </w:tcPr>
+          <w:p>
+            <w:pPr>
+              <w:spacing w:after="40"/>
+            </w:pPr>
+            <w:r/>
+            <w:r>
+              <w:rPr>
+                <w:sz w:val="18"/>
+              </w:rPr>
+              <w:t>Blood Bank Staff, Administrator</w:t>
+            </w:r>
+          </w:p>
+        </w:tc>
+        <w:tc>
+          <w:tcPr>
+            <w:tcW w:type="dxa" w:w="2556"/>
+          </w:tcPr>
+          <w:p>
+            <w:pPr>
+              <w:spacing w:after="40"/>
+            </w:pPr>
+            <w:r/>
+            <w:r>
+              <w:rPr>
+                <w:sz w:val="18"/>
+              </w:rPr>
+              <w:t>REQ-16 to REQ-21</w:t>
+            </w:r>
+          </w:p>
+        </w:tc>
+      </w:tr>
+      <w:tr>
+        <w:tc>
+          <w:tcPr>
+            <w:tcW w:type="dxa" w:w="2556"/>
+          </w:tcPr>
+          <w:p>
+            <w:pPr>
+              <w:spacing w:after="40"/>
+            </w:pPr>
+            <w:r/>
+            <w:r>
+              <w:rPr>
+                <w:sz w:val="18"/>
+              </w:rPr>
+              <w:t>UC9</w:t>
+            </w:r>
+          </w:p>
+        </w:tc>
+        <w:tc>
+          <w:tcPr>
+            <w:tcW w:type="dxa" w:w="2556"/>
+          </w:tcPr>
+          <w:p>
+            <w:pPr>
+              <w:spacing w:after="40"/>
+            </w:pPr>
+            <w:r/>
+            <w:r>
+              <w:rPr>
+                <w:sz w:val="18"/>
+              </w:rPr>
+              <w:t>Discard Unit</w:t>
+            </w:r>
+          </w:p>
+        </w:tc>
+        <w:tc>
+          <w:tcPr>
+            <w:tcW w:type="dxa" w:w="2556"/>
+          </w:tcPr>
+          <w:p>
+            <w:pPr>
+              <w:spacing w:after="40"/>
+            </w:pPr>
+            <w:r/>
+            <w:r>
+              <w:rPr>
+                <w:sz w:val="18"/>
+              </w:rPr>
+              <w:t>Blood Bank Staff</w:t>
+            </w:r>
+          </w:p>
+        </w:tc>
+        <w:tc>
+          <w:tcPr>
+            <w:tcW w:type="dxa" w:w="2556"/>
+          </w:tcPr>
+          <w:p>
+            <w:pPr>
+              <w:spacing w:after="40"/>
+            </w:pPr>
+            <w:r/>
+            <w:r>
+              <w:rPr>
+                <w:sz w:val="18"/>
+              </w:rPr>
+              <w:t>REQ-22, REQ-23</w:t>
+            </w:r>
+          </w:p>
+        </w:tc>
+      </w:tr>
+      <w:tr>
+        <w:tc>
+          <w:tcPr>
+            <w:tcW w:type="dxa" w:w="2556"/>
+          </w:tcPr>
+          <w:p>
+            <w:pPr>
+              <w:spacing w:after="40"/>
+            </w:pPr>
+            <w:r/>
+            <w:r>
+              <w:rPr>
+                <w:sz w:val="18"/>
+              </w:rPr>
+              <w:t>UC10</w:t>
+            </w:r>
+          </w:p>
+        </w:tc>
+        <w:tc>
+          <w:tcPr>
+            <w:tcW w:type="dxa" w:w="2556"/>
+          </w:tcPr>
+          <w:p>
+            <w:pPr>
+              <w:spacing w:after="40"/>
+            </w:pPr>
+            <w:r/>
+            <w:r>
+              <w:rPr>
+                <w:sz w:val="18"/>
+              </w:rPr>
+              <w:t>Raise Blood Request</w:t>
+            </w:r>
+          </w:p>
+        </w:tc>
+        <w:tc>
+          <w:tcPr>
+            <w:tcW w:type="dxa" w:w="2556"/>
+          </w:tcPr>
+          <w:p>
+            <w:pPr>
+              <w:spacing w:after="40"/>
+            </w:pPr>
+            <w:r/>
+            <w:r>
+              <w:rPr>
+                <w:sz w:val="18"/>
+              </w:rPr>
+              <w:t>Hospital User</w:t>
+            </w:r>
+          </w:p>
+        </w:tc>
+        <w:tc>
+          <w:tcPr>
+            <w:tcW w:type="dxa" w:w="2556"/>
+          </w:tcPr>
+          <w:p>
+            <w:pPr>
+              <w:spacing w:after="40"/>
+            </w:pPr>
+            <w:r/>
+            <w:r>
+              <w:rPr>
+                <w:sz w:val="18"/>
+              </w:rPr>
+              <w:t>REQ-24, REQ-25</w:t>
+            </w:r>
+          </w:p>
+        </w:tc>
+      </w:tr>
+      <w:tr>
+        <w:tc>
+          <w:tcPr>
+            <w:tcW w:type="dxa" w:w="2556"/>
+          </w:tcPr>
+          <w:p>
+            <w:pPr>
+              <w:spacing w:after="40"/>
+            </w:pPr>
+            <w:r/>
+            <w:r>
+              <w:rPr>
+                <w:sz w:val="18"/>
+              </w:rPr>
+              <w:t>UC11</w:t>
+            </w:r>
+          </w:p>
+        </w:tc>
+        <w:tc>
+          <w:tcPr>
+            <w:tcW w:type="dxa" w:w="2556"/>
+          </w:tcPr>
+          <w:p>
+            <w:pPr>
+              <w:spacing w:after="40"/>
+            </w:pPr>
+            <w:r/>
+            <w:r>
+              <w:rPr>
+                <w:sz w:val="18"/>
+              </w:rPr>
+              <w:t>Track or Cancel Request</w:t>
+            </w:r>
+          </w:p>
+        </w:tc>
+        <w:tc>
+          <w:tcPr>
+            <w:tcW w:type="dxa" w:w="2556"/>
+          </w:tcPr>
+          <w:p>
+            <w:pPr>
+              <w:spacing w:after="40"/>
+            </w:pPr>
+            <w:r/>
+            <w:r>
+              <w:rPr>
+                <w:sz w:val="18"/>
+              </w:rPr>
+              <w:t>Hospital User</w:t>
+            </w:r>
+          </w:p>
+        </w:tc>
+        <w:tc>
+          <w:tcPr>
+            <w:tcW w:type="dxa" w:w="2556"/>
+          </w:tcPr>
+          <w:p>
+            <w:pPr>
+              <w:spacing w:after="40"/>
+            </w:pPr>
+            <w:r/>
+            <w:r>
+              <w:rPr>
+                <w:sz w:val="18"/>
+              </w:rPr>
+              <w:t>REQ-30, REQ-31, REQ-44</w:t>
+            </w:r>
+          </w:p>
+        </w:tc>
+      </w:tr>
+      <w:tr>
+        <w:tc>
+          <w:tcPr>
+            <w:tcW w:type="dxa" w:w="2556"/>
+          </w:tcPr>
+          <w:p>
+            <w:pPr>
+              <w:spacing w:after="40"/>
+            </w:pPr>
+            <w:r/>
+            <w:r>
+              <w:rPr>
+                <w:sz w:val="18"/>
+              </w:rPr>
+              <w:t>UC12</w:t>
+            </w:r>
+          </w:p>
+        </w:tc>
+        <w:tc>
+          <w:tcPr>
+            <w:tcW w:type="dxa" w:w="2556"/>
+          </w:tcPr>
+          <w:p>
+            <w:pPr>
+              <w:spacing w:after="40"/>
+            </w:pPr>
+            <w:r/>
+            <w:r>
+              <w:rPr>
+                <w:sz w:val="18"/>
+              </w:rPr>
+              <w:t>Check Availability</w:t>
+            </w:r>
+          </w:p>
+        </w:tc>
+        <w:tc>
+          <w:tcPr>
+            <w:tcW w:type="dxa" w:w="2556"/>
+          </w:tcPr>
+          <w:p>
+            <w:pPr>
+              <w:spacing w:after="40"/>
+            </w:pPr>
+            <w:r/>
+            <w:r>
+              <w:rPr>
+                <w:sz w:val="18"/>
+              </w:rPr>
+              <w:t>Hospital User</w:t>
+            </w:r>
+          </w:p>
+        </w:tc>
+        <w:tc>
+          <w:tcPr>
+            <w:tcW w:type="dxa" w:w="2556"/>
+          </w:tcPr>
+          <w:p>
+            <w:pPr>
+              <w:spacing w:after="40"/>
+            </w:pPr>
+            <w:r/>
+            <w:r>
+              <w:rPr>
+                <w:sz w:val="18"/>
+              </w:rPr>
+              <w:t>REQ-38</w:t>
+            </w:r>
+          </w:p>
+        </w:tc>
+      </w:tr>
+      <w:tr>
+        <w:tc>
+          <w:tcPr>
+            <w:tcW w:type="dxa" w:w="2556"/>
+          </w:tcPr>
+          <w:p>
+            <w:pPr>
+              <w:spacing w:after="40"/>
+            </w:pPr>
+            <w:r/>
+            <w:r>
+              <w:rPr>
+                <w:sz w:val="18"/>
+              </w:rPr>
+              <w:t>UC13</w:t>
+            </w:r>
+          </w:p>
+        </w:tc>
+        <w:tc>
+          <w:tcPr>
+            <w:tcW w:type="dxa" w:w="2556"/>
+          </w:tcPr>
+          <w:p>
+            <w:pPr>
+              <w:spacing w:after="40"/>
+            </w:pPr>
+            <w:r/>
+            <w:r>
+              <w:rPr>
+                <w:sz w:val="18"/>
+              </w:rPr>
+              <w:t>Approve or Reject Request</w:t>
+            </w:r>
+          </w:p>
+        </w:tc>
+        <w:tc>
+          <w:tcPr>
+            <w:tcW w:type="dxa" w:w="2556"/>
+          </w:tcPr>
+          <w:p>
+            <w:pPr>
+              <w:spacing w:after="40"/>
+            </w:pPr>
+            <w:r/>
+            <w:r>
+              <w:rPr>
+                <w:sz w:val="18"/>
+              </w:rPr>
+              <w:t>Blood Bank Staff</w:t>
+            </w:r>
+          </w:p>
+        </w:tc>
+        <w:tc>
+          <w:tcPr>
+            <w:tcW w:type="dxa" w:w="2556"/>
+          </w:tcPr>
+          <w:p>
+            <w:pPr>
+              <w:spacing w:after="40"/>
+            </w:pPr>
+            <w:r/>
+            <w:r>
+              <w:rPr>
+                <w:sz w:val="18"/>
+              </w:rPr>
+              <w:t>REQ-26, REQ-27</w:t>
+            </w:r>
+          </w:p>
+        </w:tc>
+      </w:tr>
+      <w:tr>
+        <w:tc>
+          <w:tcPr>
+            <w:tcW w:type="dxa" w:w="2556"/>
+          </w:tcPr>
+          <w:p>
+            <w:pPr>
+              <w:spacing w:after="40"/>
+            </w:pPr>
+            <w:r/>
+            <w:r>
+              <w:rPr>
+                <w:sz w:val="18"/>
+              </w:rPr>
+              <w:t>UC14</w:t>
+            </w:r>
+          </w:p>
+        </w:tc>
+        <w:tc>
+          <w:tcPr>
+            <w:tcW w:type="dxa" w:w="2556"/>
+          </w:tcPr>
+          <w:p>
+            <w:pPr>
+              <w:spacing w:after="40"/>
+            </w:pPr>
+            <w:r/>
+            <w:r>
+              <w:rPr>
+                <w:sz w:val="18"/>
+              </w:rPr>
+              <w:t>Allocate and Issue Units</w:t>
+            </w:r>
+          </w:p>
+        </w:tc>
+        <w:tc>
+          <w:tcPr>
+            <w:tcW w:type="dxa" w:w="2556"/>
+          </w:tcPr>
+          <w:p>
+            <w:pPr>
+              <w:spacing w:after="40"/>
+            </w:pPr>
+            <w:r/>
+            <w:r>
+              <w:rPr>
+                <w:sz w:val="18"/>
+              </w:rPr>
+              <w:t>Blood Bank Staff</w:t>
+            </w:r>
+          </w:p>
+        </w:tc>
+        <w:tc>
+          <w:tcPr>
+            <w:tcW w:type="dxa" w:w="2556"/>
+          </w:tcPr>
+          <w:p>
+            <w:pPr>
+              <w:spacing w:after="40"/>
+            </w:pPr>
+            <w:r/>
+            <w:r>
+              <w:rPr>
+                <w:sz w:val="18"/>
+              </w:rPr>
+              <w:t>REQ-28 to REQ-30</w:t>
+            </w:r>
+          </w:p>
+        </w:tc>
+      </w:tr>
+      <w:tr>
+        <w:tc>
+          <w:tcPr>
+            <w:tcW w:type="dxa" w:w="2556"/>
+          </w:tcPr>
+          <w:p>
+            <w:pPr>
+              <w:spacing w:after="40"/>
+            </w:pPr>
+            <w:r/>
+            <w:r>
+              <w:rPr>
+                <w:sz w:val="18"/>
+              </w:rPr>
+              <w:t>UC15</w:t>
+            </w:r>
+          </w:p>
+        </w:tc>
+        <w:tc>
+          <w:tcPr>
+            <w:tcW w:type="dxa" w:w="2556"/>
+          </w:tcPr>
+          <w:p>
+            <w:pPr>
+              <w:spacing w:after="40"/>
+            </w:pPr>
+            <w:r/>
+            <w:r>
+              <w:rPr>
+                <w:sz w:val="18"/>
+              </w:rPr>
+              <w:t>Manage Camp</w:t>
+            </w:r>
+          </w:p>
+        </w:tc>
+        <w:tc>
+          <w:tcPr>
+            <w:tcW w:type="dxa" w:w="2556"/>
+          </w:tcPr>
+          <w:p>
+            <w:pPr>
+              <w:spacing w:after="40"/>
+            </w:pPr>
+            <w:r/>
+            <w:r>
+              <w:rPr>
+                <w:sz w:val="18"/>
+              </w:rPr>
+              <w:t>Blood Bank Staff, Administrator</w:t>
+            </w:r>
+          </w:p>
+        </w:tc>
+        <w:tc>
+          <w:tcPr>
+            <w:tcW w:type="dxa" w:w="2556"/>
+          </w:tcPr>
+          <w:p>
+            <w:pPr>
+              <w:spacing w:after="40"/>
+            </w:pPr>
+            <w:r/>
+            <w:r>
+              <w:rPr>
+                <w:sz w:val="18"/>
+              </w:rPr>
+              <w:t>REQ-32, REQ-33, REQ-36, REQ-37</w:t>
+            </w:r>
+          </w:p>
+        </w:tc>
+      </w:tr>
+      <w:tr>
+        <w:tc>
+          <w:tcPr>
+            <w:tcW w:type="dxa" w:w="2556"/>
+          </w:tcPr>
+          <w:p>
+            <w:pPr>
+              <w:spacing w:after="40"/>
+            </w:pPr>
+            <w:r/>
+            <w:r>
+              <w:rPr>
+                <w:sz w:val="18"/>
+              </w:rPr>
+              <w:t>UC16</w:t>
+            </w:r>
+          </w:p>
+        </w:tc>
+        <w:tc>
+          <w:tcPr>
+            <w:tcW w:type="dxa" w:w="2556"/>
+          </w:tcPr>
+          <w:p>
+            <w:pPr>
+              <w:spacing w:after="40"/>
+            </w:pPr>
+            <w:r/>
+            <w:r>
+              <w:rPr>
+                <w:sz w:val="18"/>
+              </w:rPr>
+              <w:t>Generate Reports</w:t>
+            </w:r>
+          </w:p>
+        </w:tc>
+        <w:tc>
+          <w:tcPr>
+            <w:tcW w:type="dxa" w:w="2556"/>
+          </w:tcPr>
+          <w:p>
+            <w:pPr>
+              <w:spacing w:after="40"/>
+            </w:pPr>
+            <w:r/>
+            <w:r>
+              <w:rPr>
+                <w:sz w:val="18"/>
+              </w:rPr>
+              <w:t>Staff, Hospital User, Administrator</w:t>
+            </w:r>
+          </w:p>
+        </w:tc>
+        <w:tc>
+          <w:tcPr>
+            <w:tcW w:type="dxa" w:w="2556"/>
+          </w:tcPr>
+          <w:p>
+            <w:pPr>
+              <w:spacing w:after="40"/>
+            </w:pPr>
+            <w:r/>
+            <w:r>
+              <w:rPr>
+                <w:sz w:val="18"/>
+              </w:rPr>
+              <w:t>REQ-42 to REQ-44</w:t>
+            </w:r>
+          </w:p>
+        </w:tc>
+      </w:tr>
+      <w:tr>
+        <w:tc>
+          <w:tcPr>
+            <w:tcW w:type="dxa" w:w="2556"/>
+          </w:tcPr>
+          <w:p>
+            <w:pPr>
+              <w:spacing w:after="40"/>
+            </w:pPr>
+            <w:r/>
+            <w:r>
+              <w:rPr>
+                <w:sz w:val="18"/>
+              </w:rPr>
+              <w:t>UC17</w:t>
+            </w:r>
+          </w:p>
+        </w:tc>
+        <w:tc>
+          <w:tcPr>
+            <w:tcW w:type="dxa" w:w="2556"/>
+          </w:tcPr>
+          <w:p>
+            <w:pPr>
+              <w:spacing w:after="40"/>
+            </w:pPr>
+            <w:r/>
+            <w:r>
+              <w:rPr>
+                <w:sz w:val="18"/>
+              </w:rPr>
+              <w:t>Manage Users and Roles</w:t>
+            </w:r>
+          </w:p>
+        </w:tc>
+        <w:tc>
+          <w:tcPr>
+            <w:tcW w:type="dxa" w:w="2556"/>
+          </w:tcPr>
+          <w:p>
+            <w:pPr>
+              <w:spacing w:after="40"/>
+            </w:pPr>
+            <w:r/>
+            <w:r>
+              <w:rPr>
+                <w:sz w:val="18"/>
+              </w:rPr>
+              <w:t>Administrator</w:t>
+            </w:r>
+          </w:p>
+        </w:tc>
+        <w:tc>
+          <w:tcPr>
+            <w:tcW w:type="dxa" w:w="2556"/>
+          </w:tcPr>
+          <w:p>
+            <w:pPr>
+              <w:spacing w:after="40"/>
+            </w:pPr>
+            <w:r/>
+            <w:r>
+              <w:rPr>
+                <w:sz w:val="18"/>
+              </w:rPr>
+              <w:t>REQ-45</w:t>
+            </w:r>
+          </w:p>
+        </w:tc>
+      </w:tr>
+      <w:tr>
+        <w:tc>
+          <w:tcPr>
+            <w:tcW w:type="dxa" w:w="2556"/>
+          </w:tcPr>
+          <w:p>
+            <w:pPr>
+              <w:spacing w:after="40"/>
+            </w:pPr>
+            <w:r/>
+            <w:r>
+              <w:rPr>
+                <w:sz w:val="18"/>
+              </w:rPr>
+              <w:t>UC18</w:t>
+            </w:r>
+          </w:p>
+        </w:tc>
+        <w:tc>
+          <w:tcPr>
+            <w:tcW w:type="dxa" w:w="2556"/>
+          </w:tcPr>
+          <w:p>
+            <w:pPr>
+              <w:spacing w:after="40"/>
+            </w:pPr>
+            <w:r/>
+            <w:r>
+              <w:rPr>
+                <w:sz w:val="18"/>
+              </w:rPr>
+              <w:t>Configure Parameters</w:t>
+            </w:r>
+          </w:p>
+        </w:tc>
+        <w:tc>
+          <w:tcPr>
+            <w:tcW w:type="dxa" w:w="2556"/>
+          </w:tcPr>
+          <w:p>
+            <w:pPr>
+              <w:spacing w:after="40"/>
+            </w:pPr>
+            <w:r/>
+            <w:r>
+              <w:rPr>
+                <w:sz w:val="18"/>
+              </w:rPr>
+              <w:t>Administrator</w:t>
+            </w:r>
+          </w:p>
+        </w:tc>
+        <w:tc>
+          <w:tcPr>
+            <w:tcW w:type="dxa" w:w="2556"/>
+          </w:tcPr>
+          <w:p>
+            <w:pPr>
+              <w:spacing w:after="40"/>
+            </w:pPr>
+            <w:r/>
+            <w:r>
+              <w:rPr>
+                <w:sz w:val="18"/>
+              </w:rPr>
+              <w:t>REQ-46</w:t>
+            </w:r>
+          </w:p>
+        </w:tc>
+      </w:tr>
+      <w:tr>
+        <w:tc>
+          <w:tcPr>
+            <w:tcW w:type="dxa" w:w="2556"/>
+          </w:tcPr>
+          <w:p>
+            <w:pPr>
+              <w:spacing w:after="40"/>
+            </w:pPr>
+            <w:r/>
+            <w:r>
+              <w:rPr>
+                <w:sz w:val="18"/>
+              </w:rPr>
+              <w:t>UC19</w:t>
+            </w:r>
+          </w:p>
+        </w:tc>
+        <w:tc>
+          <w:tcPr>
+            <w:tcW w:type="dxa" w:w="2556"/>
+          </w:tcPr>
+          <w:p>
+            <w:pPr>
+              <w:spacing w:after="40"/>
+            </w:pPr>
+            <w:r/>
+            <w:r>
+              <w:rPr>
+                <w:sz w:val="18"/>
+              </w:rPr>
+              <w:t>Send Notification</w:t>
+            </w:r>
+          </w:p>
+        </w:tc>
+        <w:tc>
+          <w:tcPr>
+            <w:tcW w:type="dxa" w:w="2556"/>
+          </w:tcPr>
+          <w:p>
+            <w:pPr>
+              <w:spacing w:after="40"/>
+            </w:pPr>
+            <w:r/>
+            <w:r>
+              <w:rPr>
+                <w:sz w:val="18"/>
+              </w:rPr>
+              <w:t>System (SMS and Email gateways)</w:t>
+            </w:r>
+          </w:p>
+        </w:tc>
+        <w:tc>
+          <w:tcPr>
+            <w:tcW w:type="dxa" w:w="2556"/>
+          </w:tcPr>
+          <w:p>
+            <w:pPr>
+              <w:spacing w:after="40"/>
+            </w:pPr>
+            <w:r/>
+            <w:r>
+              <w:rPr>
+                <w:sz w:val="18"/>
+              </w:rPr>
+              <w:t>REQ-39 to REQ-41</w:t>
+            </w:r>
+          </w:p>
+        </w:tc>
+      </w:tr>
+    </w:tbl>
+    <w:p/>
+    <w:p>
+      <w:pPr>
+        <w:pStyle w:val="Heading2"/>
+      </w:pPr>
+      <w:r>
+        <w:t>4.3 Other Models</w:t>
+      </w:r>
+    </w:p>
+    <w:tbl>
+      <w:tblPr>
+        <w:tblStyle w:val="TableGrid"/>
+        <w:tblW w:type="auto" w:w="0"/>
+        <w:tblLayout w:type="autofit"/>
+        <w:tblLook w:firstColumn="1" w:firstRow="1" w:lastColumn="0" w:lastRow="0" w:noHBand="0" w:noVBand="1" w:val="04A0"/>
+      </w:tblPr>
+      <w:tblGrid>
+        <w:gridCol w:w="3408"/>
+        <w:gridCol w:w="3408"/>
+        <w:gridCol w:w="3408"/>
+      </w:tblGrid>
+      <w:tr>
+        <w:trPr>
+          <w:tblHeader w:val="true"/>
+        </w:trPr>
+        <w:tc>
+          <w:tcPr>
+            <w:tcW w:type="dxa" w:w="3408"/>
+            <w:shd w:val="clear" w:fill="DCE6F1"/>
+          </w:tcPr>
+          <w:p>
+            <w:pPr>
+              <w:spacing w:after="40"/>
+            </w:pPr>
+            <w:r>
+              <w:rPr>
+                <w:b/>
+              </w:rPr>
+            </w:r>
+            <w:r>
+              <w:rPr>
+                <w:b/>
+                <w:sz w:val="18"/>
+              </w:rPr>
+              <w:t>Model</w:t>
+            </w:r>
+          </w:p>
+        </w:tc>
+        <w:tc>
+          <w:tcPr>
+            <w:tcW w:type="dxa" w:w="3408"/>
+            <w:shd w:val="clear" w:fill="DCE6F1"/>
+          </w:tcPr>
+          <w:p>
+            <w:pPr>
+              <w:spacing w:after="40"/>
+            </w:pPr>
+            <w:r>
+              <w:rPr>
+                <w:b/>
+              </w:rPr>
+            </w:r>
+            <w:r>
+              <w:rPr>
+                <w:b/>
+                <w:sz w:val="18"/>
+              </w:rPr>
+              <w:t>Source File</w:t>
+            </w:r>
+          </w:p>
+        </w:tc>
+        <w:tc>
+          <w:tcPr>
+            <w:tcW w:type="dxa" w:w="3408"/>
+            <w:shd w:val="clear" w:fill="DCE6F1"/>
+          </w:tcPr>
+          <w:p>
+            <w:pPr>
+              <w:spacing w:after="40"/>
+            </w:pPr>
+            <w:r>
+              <w:rPr>
+                <w:b/>
+              </w:rPr>
+            </w:r>
+            <w:r>
+              <w:rPr>
+                <w:b/>
+                <w:sz w:val="18"/>
+              </w:rPr>
+              <w:t>Purpose</w:t>
+            </w:r>
+          </w:p>
+        </w:tc>
+      </w:tr>
+      <w:tr>
+        <w:tc>
+          <w:tcPr>
+            <w:tcW w:type="dxa" w:w="3408"/>
+          </w:tcPr>
+          <w:p>
+            <w:pPr>
+              <w:spacing w:after="40"/>
+            </w:pPr>
+            <w:r/>
+            <w:r>
+              <w:rPr>
+                <w:sz w:val="18"/>
+              </w:rPr>
+              <w:t>Entity Relationship Diagram</w:t>
+            </w:r>
+          </w:p>
+        </w:tc>
+        <w:tc>
+          <w:tcPr>
+            <w:tcW w:type="dxa" w:w="3408"/>
+          </w:tcPr>
+          <w:p>
+            <w:pPr>
+              <w:spacing w:after="40"/>
+            </w:pPr>
+            <w:r/>
+            <w:r>
+              <w:rPr>
+                <w:rFonts w:ascii="Consolas" w:hAnsi="Consolas"/>
+                <w:color w:val="B03060"/>
+                <w:sz w:val="18"/>
+              </w:rPr>
+              <w:t>diagrams/er-diagram.mmd</w:t>
+            </w:r>
+          </w:p>
+        </w:tc>
+        <w:tc>
+          <w:tcPr>
+            <w:tcW w:type="dxa" w:w="3408"/>
+          </w:tcPr>
+          <w:p>
+            <w:pPr>
+              <w:spacing w:after="40"/>
+            </w:pPr>
+            <w:r/>
+            <w:r>
+              <w:rPr>
+                <w:sz w:val="18"/>
+              </w:rPr>
+              <w:t>Persistent entities, attributes and cardinalities</w:t>
+            </w:r>
+          </w:p>
+        </w:tc>
+      </w:tr>
+      <w:tr>
+        <w:tc>
+          <w:tcPr>
+            <w:tcW w:type="dxa" w:w="3408"/>
+          </w:tcPr>
+          <w:p>
+            <w:pPr>
+              <w:spacing w:after="40"/>
+            </w:pPr>
+            <w:r/>
+            <w:r>
+              <w:rPr>
+                <w:sz w:val="18"/>
+              </w:rPr>
+              <w:t>Data Flow Diagram, Level 0</w:t>
+            </w:r>
+          </w:p>
+        </w:tc>
+        <w:tc>
+          <w:tcPr>
+            <w:tcW w:type="dxa" w:w="3408"/>
+          </w:tcPr>
+          <w:p>
+            <w:pPr>
+              <w:spacing w:after="40"/>
+            </w:pPr>
+            <w:r/>
+            <w:r>
+              <w:rPr>
+                <w:rFonts w:ascii="Consolas" w:hAnsi="Consolas"/>
+                <w:color w:val="B03060"/>
+                <w:sz w:val="18"/>
+              </w:rPr>
+              <w:t>diagrams/dfd-level0.mmd</w:t>
+            </w:r>
+          </w:p>
+        </w:tc>
+        <w:tc>
+          <w:tcPr>
+            <w:tcW w:type="dxa" w:w="3408"/>
+          </w:tcPr>
+          <w:p>
+            <w:pPr>
+              <w:spacing w:after="40"/>
+            </w:pPr>
+            <w:r/>
+            <w:r>
+              <w:rPr>
+                <w:sz w:val="18"/>
+              </w:rPr>
+              <w:t>System context and external entities</w:t>
+            </w:r>
+          </w:p>
+        </w:tc>
+      </w:tr>
+      <w:tr>
+        <w:tc>
+          <w:tcPr>
+            <w:tcW w:type="dxa" w:w="3408"/>
+          </w:tcPr>
+          <w:p>
+            <w:pPr>
+              <w:spacing w:after="40"/>
+            </w:pPr>
+            <w:r/>
+            <w:r>
+              <w:rPr>
+                <w:sz w:val="18"/>
+              </w:rPr>
+              <w:t>Data Flow Diagram, Level 1 Sheet A</w:t>
+            </w:r>
+          </w:p>
+        </w:tc>
+        <w:tc>
+          <w:tcPr>
+            <w:tcW w:type="dxa" w:w="3408"/>
+          </w:tcPr>
+          <w:p>
+            <w:pPr>
+              <w:spacing w:after="40"/>
+            </w:pPr>
+            <w:r/>
+            <w:r>
+              <w:rPr>
+                <w:rFonts w:ascii="Consolas" w:hAnsi="Consolas"/>
+                <w:color w:val="B03060"/>
+                <w:sz w:val="18"/>
+              </w:rPr>
+              <w:t>diagrams/dfd-level1a-supply.mmd</w:t>
+            </w:r>
+          </w:p>
+        </w:tc>
+        <w:tc>
+          <w:tcPr>
+            <w:tcW w:type="dxa" w:w="3408"/>
+          </w:tcPr>
+          <w:p>
+            <w:pPr>
+              <w:spacing w:after="40"/>
+            </w:pPr>
+            <w:r/>
+            <w:r>
+              <w:rPr>
+                <w:sz w:val="18"/>
+              </w:rPr>
+              <w:t>Processes 1.0 to 4.0, the supply side</w:t>
+            </w:r>
+          </w:p>
+        </w:tc>
+      </w:tr>
+      <w:tr>
+        <w:tc>
+          <w:tcPr>
+            <w:tcW w:type="dxa" w:w="3408"/>
+          </w:tcPr>
+          <w:p>
+            <w:pPr>
+              <w:spacing w:after="40"/>
+            </w:pPr>
+            <w:r/>
+            <w:r>
+              <w:rPr>
+                <w:sz w:val="18"/>
+              </w:rPr>
+              <w:t>Data Flow Diagram, Level 1 Sheet B</w:t>
+            </w:r>
+          </w:p>
+        </w:tc>
+        <w:tc>
+          <w:tcPr>
+            <w:tcW w:type="dxa" w:w="3408"/>
+          </w:tcPr>
+          <w:p>
+            <w:pPr>
+              <w:spacing w:after="40"/>
+            </w:pPr>
+            <w:r/>
+            <w:r>
+              <w:rPr>
+                <w:rFonts w:ascii="Consolas" w:hAnsi="Consolas"/>
+                <w:color w:val="B03060"/>
+                <w:sz w:val="18"/>
+              </w:rPr>
+              <w:t>diagrams/dfd-level1b-demand.mmd</w:t>
+            </w:r>
+          </w:p>
+        </w:tc>
+        <w:tc>
+          <w:tcPr>
+            <w:tcW w:type="dxa" w:w="3408"/>
+          </w:tcPr>
+          <w:p>
+            <w:pPr>
+              <w:spacing w:after="40"/>
+            </w:pPr>
+            <w:r/>
+            <w:r>
+              <w:rPr>
+                <w:sz w:val="18"/>
+              </w:rPr>
+              <w:t>Processes 5.0 to 9.0, demand, camps and reporting</w:t>
+            </w:r>
+          </w:p>
+        </w:tc>
+      </w:tr>
+      <w:tr>
+        <w:tc>
+          <w:tcPr>
+            <w:tcW w:type="dxa" w:w="3408"/>
+          </w:tcPr>
+          <w:p>
+            <w:pPr>
+              <w:spacing w:after="40"/>
+            </w:pPr>
+            <w:r/>
+            <w:r>
+              <w:rPr>
+                <w:sz w:val="18"/>
+              </w:rPr>
+              <w:t>Architecture Diagram</w:t>
+            </w:r>
+          </w:p>
+        </w:tc>
+        <w:tc>
+          <w:tcPr>
+            <w:tcW w:type="dxa" w:w="3408"/>
+          </w:tcPr>
+          <w:p>
+            <w:pPr>
+              <w:spacing w:after="40"/>
+            </w:pPr>
+            <w:r/>
+            <w:r>
+              <w:rPr>
+                <w:rFonts w:ascii="Consolas" w:hAnsi="Consolas"/>
+                <w:color w:val="B03060"/>
+                <w:sz w:val="18"/>
+              </w:rPr>
+              <w:t>diagrams/architecture.mmd</w:t>
+            </w:r>
+          </w:p>
+        </w:tc>
+        <w:tc>
+          <w:tcPr>
+            <w:tcW w:type="dxa" w:w="3408"/>
+          </w:tcPr>
+          <w:p>
+            <w:pPr>
+              <w:spacing w:after="40"/>
+            </w:pPr>
+            <w:r/>
+            <w:r>
+              <w:rPr>
+                <w:sz w:val="18"/>
+              </w:rPr>
+              <w:t>Tier decomposition and external gateways</w:t>
+            </w:r>
+          </w:p>
+        </w:tc>
+      </w:tr>
+    </w:tbl>
+    <w:p/>
+    <w:p>
+      <w:pPr>
+        <w:pStyle w:val="Heading1"/>
+      </w:pPr>
+      <w:r>
+        <w:t>5. System Features</w:t>
+      </w:r>
+    </w:p>
+    <w:p>
+      <w:pPr>
+        <w:spacing w:after="120"/>
+      </w:pPr>
+      <w:r>
         <w:t xml:space="preserve">The functional requirements are organised by system feature, which are the major services the product provides. Six features are specified. Each requirement carries a unique tag of the form </w:t>
       </w:r>
       <w:r>
@@ -6884,6 +8263,58 @@
       </w:pPr>
       <w:r>
         <w:t>6.3 Security Requirements</w:t>
+      </w:r>
+    </w:p>
+    <w:p>
+      <w:pPr>
+        <w:spacing w:after="120"/>
+      </w:pPr>
+      <w:r>
+        <w:rPr>
+          <w:b/>
+        </w:rPr>
+        <w:t>Security Objectives.</w:t>
+      </w:r>
+      <w:r>
+        <w:t xml:space="preserve"> The eleven requirements below exist to satisfy two higher-level objectives, stated here so that a future requirement can be checked against intent rather than only against the existing list.</w:t>
+      </w:r>
+    </w:p>
+    <w:p>
+      <w:pPr>
+        <w:spacing w:after="120"/>
+      </w:pPr>
+      <w:r>
+        <w:rPr>
+          <w:b/>
+        </w:rPr>
+        <w:t>SEC-OBJ-1, Confidentiality of donor and patient data.</w:t>
+      </w:r>
+      <w:r>
+        <w:t xml:space="preserve"> No party outside the blood bank's own staff and administrators shall be able to view a donor's identity or medical history, and no party outside a hospital's own authorised users shall be able to view another hospital's request or patient-reference data. This objective is what NFR-SEC6, NFR-SEC7 and BR-9 exist to enforce, and it is addressed architecturally, not only procedurally, in </w:t>
+      </w:r>
+      <w:r>
+        <w:rPr>
+          <w:rFonts w:ascii="Consolas" w:hAnsi="Consolas"/>
+          <w:color w:val="B03060"/>
+        </w:rPr>
+        <w:t>docs/SAD.md</w:t>
+      </w:r>
+      <w:r>
+        <w:t xml:space="preserve"> Section 3.9.</w:t>
+      </w:r>
+    </w:p>
+    <w:p>
+      <w:pPr>
+        <w:spacing w:after="120"/>
+      </w:pPr>
+      <w:r>
+        <w:rPr>
+          <w:b/>
+        </w:rPr>
+        <w:t>SEC-OBJ-2, Integrity and non-repudiation of safety-critical transactions.</w:t>
+      </w:r>
+      <w:r>
+        <w:t xml:space="preserve"> Every transition of a blood unit's status, and every approval, allocation or issue against a hospital request, shall be attributable to a specific authenticated user and shall be impossible to alter or delete after the fact. This objective is what NFR-SEC10 (audit logging) and the state-machine constraints in NFR-S1 through NFR-S4 exist to enforce.</w:t>
       </w:r>
     </w:p>
     <w:p>

</xml_diff>